<commit_message>
Refactor dataset class and update .gitignore
Removed unused imports and the 'quick' parameter from CustomSpeechCommandsDataset_Repcycle. Updated .gitignore to exclude new dataset directories. Added profiling output and new model checkpoint files.
</commit_message>
<xml_diff>
--- a/AndreiNotes.docx
+++ b/AndreiNotes.docx
@@ -48,6 +48,11 @@
     </w:p>
     <w:p>
       <w:r>
+        <w:t>Timing AST</w:t>
+      </w:r>
+    </w:p>
+    <w:p>
+      <w:r>
         <w:t>Get a fast and dirty efficient</w:t>
       </w:r>
       <w:r>
@@ -69,11 +74,94 @@
       </w:r>
       <w:r>
         <w:t>.</w:t>
+      </w:r>
+    </w:p>
+    <w:p>
+      <w:pPr>
+        <w:pStyle w:val="ListParagraph"/>
+        <w:numPr>
+          <w:ilvl w:val="0"/>
+          <w:numId w:val="1"/>
+        </w:numPr>
+      </w:pPr>
+      <w:r>
+        <w:t>Jump in the middle of the file</w:t>
+      </w:r>
+    </w:p>
+    <w:p>
+      <w:pPr>
+        <w:pStyle w:val="ListParagraph"/>
+        <w:numPr>
+          <w:ilvl w:val="0"/>
+          <w:numId w:val="1"/>
+        </w:numPr>
+      </w:pPr>
+      <w:r>
+        <w:t>Find zero crossing</w:t>
+      </w:r>
+      <w:r>
+        <w:t>s going left and jump</w:t>
+      </w:r>
+      <w:r>
+        <w:t xml:space="preserve"> by F0 to</w:t>
+      </w:r>
+      <w:r>
+        <w:t xml:space="preserve"> next zero crossing</w:t>
       </w:r>
     </w:p>
     <w:p/>
     <w:p>
       <w:r>
+        <w:rPr>
+          <w:color w:val="0070C0"/>
+        </w:rPr>
+        <w:t xml:space="preserve">Use FFT </w:t>
+      </w:r>
+      <w:proofErr w:type="spellStart"/>
+      <w:r>
+        <w:rPr>
+          <w:color w:val="0070C0"/>
+        </w:rPr>
+        <w:t>quess</w:t>
+      </w:r>
+      <w:proofErr w:type="spellEnd"/>
+      <w:r>
+        <w:rPr>
+          <w:color w:val="0070C0"/>
+        </w:rPr>
+        <w:t xml:space="preserve"> </w:t>
+      </w:r>
+      <w:r>
+        <w:t xml:space="preserve">vs </w:t>
+      </w:r>
+      <w:r>
+        <w:rPr>
+          <w:color w:val="EE0000"/>
+        </w:rPr>
+        <w:t>use average 100 samples</w:t>
+      </w:r>
+      <w:r>
+        <w:br/>
+      </w:r>
+      <w:r>
+        <w:rPr>
+          <w:color w:val="0070C0"/>
+        </w:rPr>
+        <w:t>Ignore segments with low RMS</w:t>
+      </w:r>
+      <w:r>
+        <w:t xml:space="preserve"> vs </w:t>
+      </w:r>
+      <w:r>
+        <w:rPr>
+          <w:color w:val="EE0000"/>
+        </w:rPr>
+        <w:t>use all</w:t>
+      </w:r>
+    </w:p>
+    <w:p/>
+    <w:p>
+      <w:r>
         <w:t xml:space="preserve">FFT for guessing </w:t>
       </w:r>
       <w:r>
@@ -91,15 +179,29 @@
       <w:proofErr w:type="spellEnd"/>
     </w:p>
     <w:p>
-      <w:r>
+      <w:pPr>
+        <w:rPr>
+          <w:strike/>
+        </w:rPr>
+      </w:pPr>
+      <w:r>
+        <w:rPr>
+          <w:strike/>
+        </w:rPr>
         <w:t xml:space="preserve">Get general </w:t>
       </w:r>
       <w:proofErr w:type="spellStart"/>
       <w:r>
+        <w:rPr>
+          <w:strike/>
+        </w:rPr>
         <w:t>patchify</w:t>
       </w:r>
       <w:proofErr w:type="spellEnd"/>
       <w:r>
+        <w:rPr>
+          <w:strike/>
+        </w:rPr>
         <w:t xml:space="preserve"> </w:t>
       </w:r>
     </w:p>

</xml_diff>

<commit_message>
Update AST notebooks and rename FFT denoised notebook
Renamed TEST_FAST_FFT_DENOISED.ipynb to TEST_FAST_FFT_NOISY copy.ipynb and updated execution counts, outputs, and parameters. Modified Spectrogram_Transformer/AST.ipynb to use new model paths, device info, patch sizes, and fixed minor typos. Adjusted Spectrogram_Transformer/inferenceAST.ipynb for input formatting and code consistency.
</commit_message>
<xml_diff>
--- a/AndreiNotes.docx
+++ b/AndreiNotes.docx
@@ -111,6 +111,11 @@
     </w:p>
     <w:p/>
     <w:p>
+      <w:pPr>
+        <w:rPr>
+          <w:color w:val="EE0000"/>
+        </w:rPr>
+      </w:pPr>
       <w:r>
         <w:rPr>
           <w:color w:val="0070C0"/>
@@ -159,8 +164,140 @@
         <w:t>use all</w:t>
       </w:r>
     </w:p>
+    <w:p>
+      <w:r>
+        <w:t>Make the back-and-forth</w:t>
+      </w:r>
+      <w:r>
+        <w:t xml:space="preserve"> zero crossing find </w:t>
+      </w:r>
+    </w:p>
     <w:p/>
     <w:p>
+      <w:pPr>
+        <w:rPr>
+          <w:b/>
+          <w:bCs/>
+        </w:rPr>
+      </w:pPr>
+    </w:p>
+    <w:p>
+      <w:pPr>
+        <w:rPr>
+          <w:b/>
+          <w:bCs/>
+        </w:rPr>
+      </w:pPr>
+      <w:r>
+        <w:rPr>
+          <w:b/>
+          <w:bCs/>
+        </w:rPr>
+        <w:t xml:space="preserve">Compare AT and AST training times and </w:t>
+      </w:r>
+      <w:r>
+        <w:rPr>
+          <w:b/>
+          <w:bCs/>
+        </w:rPr>
+        <w:t>inference</w:t>
+      </w:r>
+      <w:r>
+        <w:rPr>
+          <w:b/>
+          <w:bCs/>
+        </w:rPr>
+        <w:t xml:space="preserve"> time</w:t>
+      </w:r>
+    </w:p>
+    <w:p>
+      <w:pPr>
+        <w:rPr>
+          <w:b/>
+          <w:bCs/>
+        </w:rPr>
+      </w:pPr>
+      <w:r>
+        <w:rPr>
+          <w:b/>
+          <w:bCs/>
+        </w:rPr>
+        <w:t>EPOCHS</w:t>
+      </w:r>
+    </w:p>
+    <w:p>
+      <w:pPr>
+        <w:rPr>
+          <w:b/>
+          <w:bCs/>
+        </w:rPr>
+      </w:pPr>
+    </w:p>
+    <w:p>
+      <w:pPr>
+        <w:rPr>
+          <w:b/>
+          <w:bCs/>
+          <w:sz w:val="32"/>
+          <w:szCs w:val="32"/>
+        </w:rPr>
+      </w:pPr>
+      <w:r>
+        <w:rPr>
+          <w:b/>
+          <w:bCs/>
+          <w:sz w:val="32"/>
+          <w:szCs w:val="32"/>
+        </w:rPr>
+        <w:t>Training Time</w:t>
+      </w:r>
+    </w:p>
+    <w:p>
+      <w:pPr>
+        <w:rPr>
+          <w:b/>
+          <w:bCs/>
+          <w:sz w:val="32"/>
+          <w:szCs w:val="32"/>
+        </w:rPr>
+      </w:pPr>
+      <w:r>
+        <w:rPr>
+          <w:b/>
+          <w:bCs/>
+          <w:sz w:val="32"/>
+          <w:szCs w:val="32"/>
+        </w:rPr>
+        <w:t>Inference Time</w:t>
+      </w:r>
+    </w:p>
+    <w:p>
+      <w:pPr>
+        <w:rPr>
+          <w:b/>
+          <w:bCs/>
+          <w:sz w:val="32"/>
+          <w:szCs w:val="32"/>
+        </w:rPr>
+      </w:pPr>
+      <w:r>
+        <w:rPr>
+          <w:b/>
+          <w:bCs/>
+          <w:sz w:val="32"/>
+          <w:szCs w:val="32"/>
+        </w:rPr>
+        <w:t>Data Usage</w:t>
+      </w:r>
+    </w:p>
+    <w:p/>
+    <w:p>
+      <w:r>
+        <w:t>For inference time, use a crude timing on one file</w:t>
+      </w:r>
+    </w:p>
+    <w:p/>
+    <w:p>
       <w:r>
         <w:t xml:space="preserve">FFT for guessing </w:t>
       </w:r>
@@ -215,6 +352,7 @@
     </w:p>
     <w:p>
       <w:r>
+        <w:lastRenderedPageBreak/>
         <w:t xml:space="preserve">Timing </w:t>
       </w:r>
       <w:r>

</xml_diff>

<commit_message>
Update Repcycle speech commands and training workflow
added process_repcycles_FAST_FFT_NOISY_GBS in CustomSpeechCommands_Repcycle.py. Deleted CustomSpeechCommands_Repcycle2.py. Updated Jupyter notebooks and model paths to use the new GBS variant. Added new audio and figure files, and removed obsolete ones.
</commit_message>
<xml_diff>
--- a/AndreiNotes.docx
+++ b/AndreiNotes.docx
@@ -290,6 +290,84 @@
         <w:t>Data Usage</w:t>
       </w:r>
     </w:p>
+    <w:p>
+      <w:pPr>
+        <w:rPr>
+          <w:b/>
+          <w:bCs/>
+          <w:sz w:val="32"/>
+          <w:szCs w:val="32"/>
+        </w:rPr>
+      </w:pPr>
+    </w:p>
+    <w:p>
+      <w:pPr>
+        <w:rPr>
+          <w:b/>
+          <w:bCs/>
+          <w:sz w:val="32"/>
+          <w:szCs w:val="32"/>
+        </w:rPr>
+      </w:pPr>
+      <w:r>
+        <w:rPr>
+          <w:b/>
+          <w:bCs/>
+          <w:sz w:val="32"/>
+          <w:szCs w:val="32"/>
+        </w:rPr>
+        <w:t>Complete randomness Control</w:t>
+      </w:r>
+    </w:p>
+    <w:p>
+      <w:pPr>
+        <w:rPr>
+          <w:b/>
+          <w:bCs/>
+          <w:sz w:val="32"/>
+          <w:szCs w:val="32"/>
+        </w:rPr>
+      </w:pPr>
+      <w:r>
+        <w:rPr>
+          <w:b/>
+          <w:bCs/>
+          <w:sz w:val="32"/>
+          <w:szCs w:val="32"/>
+        </w:rPr>
+        <w:t>Use the whole sample control</w:t>
+      </w:r>
+    </w:p>
+    <w:p>
+      <w:pPr>
+        <w:rPr>
+          <w:b/>
+          <w:bCs/>
+          <w:sz w:val="32"/>
+          <w:szCs w:val="32"/>
+        </w:rPr>
+      </w:pPr>
+      <w:r>
+        <w:rPr>
+          <w:b/>
+          <w:bCs/>
+          <w:sz w:val="32"/>
+          <w:szCs w:val="32"/>
+        </w:rPr>
+        <w:t xml:space="preserve">Hand-pick </w:t>
+      </w:r>
+      <w:proofErr w:type="spellStart"/>
+      <w:r>
+        <w:rPr>
+          <w:b/>
+          <w:bCs/>
+          <w:sz w:val="32"/>
+          <w:szCs w:val="32"/>
+        </w:rPr>
+        <w:t>repcycles</w:t>
+      </w:r>
+      <w:proofErr w:type="spellEnd"/>
+    </w:p>
     <w:p/>
     <w:p>
       <w:r>
@@ -352,7 +430,6 @@
     </w:p>
     <w:p>
       <w:r>
-        <w:lastRenderedPageBreak/>
         <w:t xml:space="preserve">Timing </w:t>
       </w:r>
       <w:r>

</xml_diff>

<commit_message>
Update Inference2.ipynb kernel and output details
Updated CUDA version output, kernel display name, and Python version in the notebook metadata. Added kernel crash error output to a code cell for debugging purposes. Also updated AndreiNotes.docx with new content.
</commit_message>
<xml_diff>
--- a/AndreiNotes.docx
+++ b/AndreiNotes.docx
@@ -826,7 +826,7 @@
   <w:docDefaults>
     <w:rPrDefault>
       <w:rPr>
-        <w:rFonts w:ascii="Aptos" w:hAnsi="Aptos" w:eastAsia="新細明體" w:cs="" w:asciiTheme="minorHAnsi" w:cstheme="minorBidi" w:eastAsiaTheme="minorEastAsia" w:hAnsiTheme="minorHAnsi"/>
+        <w:rFonts w:ascii="Aptos" w:hAnsi="Aptos" w:eastAsia="" w:cs="" w:asciiTheme="minorHAnsi" w:cstheme="minorBidi" w:eastAsiaTheme="minorEastAsia" w:hAnsiTheme="minorHAnsi"/>
         <w:kern w:val="2"/>
         <w:sz w:val="24"/>
         <w:szCs w:val="24"/>
@@ -1223,12 +1223,13 @@
     <w:qFormat/>
     <w:pPr>
       <w:widowControl/>
+      <w:suppressAutoHyphens w:val="true"/>
       <w:bidi w:val="0"/>
       <w:spacing w:lineRule="auto" w:line="278" w:before="0" w:after="160"/>
       <w:jc w:val="start"/>
     </w:pPr>
     <w:rPr>
-      <w:rFonts w:ascii="Aptos" w:hAnsi="Aptos" w:eastAsia="新細明體" w:cs="" w:asciiTheme="minorHAnsi" w:cstheme="minorBidi" w:eastAsiaTheme="minorEastAsia" w:hAnsiTheme="minorHAnsi"/>
+      <w:rFonts w:ascii="Aptos" w:hAnsi="Aptos" w:eastAsia="" w:cs="" w:asciiTheme="minorHAnsi" w:cstheme="minorBidi" w:eastAsiaTheme="minorEastAsia" w:hAnsiTheme="minorHAnsi"/>
       <w:color w:val="auto"/>
       <w:kern w:val="2"/>
       <w:sz w:val="24"/>
@@ -1252,7 +1253,7 @@
       <w:outlineLvl w:val="0"/>
     </w:pPr>
     <w:rPr>
-      <w:rFonts w:ascii="Aptos Display" w:hAnsi="Aptos Display" w:eastAsia="新細明體" w:cs="" w:asciiTheme="majorHAnsi" w:cstheme="majorBidi" w:eastAsiaTheme="majorEastAsia" w:hAnsiTheme="majorHAnsi"/>
+      <w:rFonts w:ascii="Aptos Display" w:hAnsi="Aptos Display" w:eastAsia="" w:cs="" w:asciiTheme="majorHAnsi" w:cstheme="majorBidi" w:eastAsiaTheme="majorEastAsia" w:hAnsiTheme="majorHAnsi"/>
       <w:color w:themeColor="accent1" w:themeShade="bf" w:val="0F4761"/>
       <w:sz w:val="40"/>
       <w:szCs w:val="40"/>
@@ -1275,7 +1276,7 @@
       <w:outlineLvl w:val="1"/>
     </w:pPr>
     <w:rPr>
-      <w:rFonts w:ascii="Aptos Display" w:hAnsi="Aptos Display" w:eastAsia="新細明體" w:cs="" w:asciiTheme="majorHAnsi" w:cstheme="majorBidi" w:eastAsiaTheme="majorEastAsia" w:hAnsiTheme="majorHAnsi"/>
+      <w:rFonts w:ascii="Aptos Display" w:hAnsi="Aptos Display" w:eastAsia="" w:cs="" w:asciiTheme="majorHAnsi" w:cstheme="majorBidi" w:eastAsiaTheme="majorEastAsia" w:hAnsiTheme="majorHAnsi"/>
       <w:color w:themeColor="accent1" w:themeShade="bf" w:val="0F4761"/>
       <w:sz w:val="32"/>
       <w:szCs w:val="32"/>
@@ -1298,7 +1299,7 @@
       <w:outlineLvl w:val="2"/>
     </w:pPr>
     <w:rPr>
-      <w:rFonts w:eastAsia="新細明體" w:cs="" w:cstheme="majorBidi" w:eastAsiaTheme="majorEastAsia"/>
+      <w:rFonts w:eastAsia="" w:cs="" w:cstheme="majorBidi" w:eastAsiaTheme="majorEastAsia"/>
       <w:color w:themeColor="accent1" w:themeShade="bf" w:val="0F4761"/>
       <w:sz w:val="28"/>
       <w:szCs w:val="28"/>
@@ -1321,7 +1322,7 @@
       <w:outlineLvl w:val="3"/>
     </w:pPr>
     <w:rPr>
-      <w:rFonts w:eastAsia="新細明體" w:cs="" w:cstheme="majorBidi" w:eastAsiaTheme="majorEastAsia"/>
+      <w:rFonts w:eastAsia="" w:cs="" w:cstheme="majorBidi" w:eastAsiaTheme="majorEastAsia"/>
       <w:i/>
       <w:iCs/>
       <w:color w:themeColor="accent1" w:themeShade="bf" w:val="0F4761"/>
@@ -1344,7 +1345,7 @@
       <w:outlineLvl w:val="4"/>
     </w:pPr>
     <w:rPr>
-      <w:rFonts w:eastAsia="新細明體" w:cs="" w:cstheme="majorBidi" w:eastAsiaTheme="majorEastAsia"/>
+      <w:rFonts w:eastAsia="" w:cs="" w:cstheme="majorBidi" w:eastAsiaTheme="majorEastAsia"/>
       <w:color w:themeColor="accent1" w:themeShade="bf" w:val="0F4761"/>
     </w:rPr>
   </w:style>
@@ -1365,7 +1366,7 @@
       <w:outlineLvl w:val="5"/>
     </w:pPr>
     <w:rPr>
-      <w:rFonts w:eastAsia="新細明體" w:cs="" w:cstheme="majorBidi" w:eastAsiaTheme="majorEastAsia"/>
+      <w:rFonts w:eastAsia="" w:cs="" w:cstheme="majorBidi" w:eastAsiaTheme="majorEastAsia"/>
       <w:i/>
       <w:iCs/>
       <w:color w:themeColor="text1" w:themeTint="a6" w:val="595959"/>
@@ -1388,7 +1389,7 @@
       <w:outlineLvl w:val="6"/>
     </w:pPr>
     <w:rPr>
-      <w:rFonts w:eastAsia="新細明體" w:cs="" w:cstheme="majorBidi" w:eastAsiaTheme="majorEastAsia"/>
+      <w:rFonts w:eastAsia="" w:cs="" w:cstheme="majorBidi" w:eastAsiaTheme="majorEastAsia"/>
       <w:color w:themeColor="text1" w:themeTint="a6" w:val="595959"/>
     </w:rPr>
   </w:style>
@@ -1409,7 +1410,7 @@
       <w:outlineLvl w:val="7"/>
     </w:pPr>
     <w:rPr>
-      <w:rFonts w:eastAsia="新細明體" w:cs="" w:cstheme="majorBidi" w:eastAsiaTheme="majorEastAsia"/>
+      <w:rFonts w:eastAsia="" w:cs="" w:cstheme="majorBidi" w:eastAsiaTheme="majorEastAsia"/>
       <w:i/>
       <w:iCs/>
       <w:color w:themeColor="text1" w:themeTint="d8" w:val="272727"/>
@@ -1432,7 +1433,7 @@
       <w:outlineLvl w:val="8"/>
     </w:pPr>
     <w:rPr>
-      <w:rFonts w:eastAsia="新細明體" w:cs="" w:cstheme="majorBidi" w:eastAsiaTheme="majorEastAsia"/>
+      <w:rFonts w:eastAsia="" w:cs="" w:cstheme="majorBidi" w:eastAsiaTheme="majorEastAsia"/>
       <w:color w:themeColor="text1" w:themeTint="d8" w:val="272727"/>
     </w:rPr>
   </w:style>
@@ -1452,7 +1453,7 @@
     <w:qFormat/>
     <w:rsid w:val="007809bc"/>
     <w:rPr>
-      <w:rFonts w:ascii="Aptos Display" w:hAnsi="Aptos Display" w:eastAsia="新細明體" w:cs="" w:asciiTheme="majorHAnsi" w:cstheme="majorBidi" w:eastAsiaTheme="majorEastAsia" w:hAnsiTheme="majorHAnsi"/>
+      <w:rFonts w:ascii="Aptos Display" w:hAnsi="Aptos Display" w:eastAsia="" w:cs="" w:asciiTheme="majorHAnsi" w:cstheme="majorBidi" w:eastAsiaTheme="majorEastAsia" w:hAnsiTheme="majorHAnsi"/>
       <w:color w:themeColor="accent1" w:themeShade="bf" w:val="0F4761"/>
       <w:sz w:val="40"/>
       <w:szCs w:val="40"/>
@@ -1467,7 +1468,7 @@
     <w:qFormat/>
     <w:rsid w:val="007809bc"/>
     <w:rPr>
-      <w:rFonts w:ascii="Aptos Display" w:hAnsi="Aptos Display" w:eastAsia="新細明體" w:cs="" w:asciiTheme="majorHAnsi" w:cstheme="majorBidi" w:eastAsiaTheme="majorEastAsia" w:hAnsiTheme="majorHAnsi"/>
+      <w:rFonts w:ascii="Aptos Display" w:hAnsi="Aptos Display" w:eastAsia="" w:cs="" w:asciiTheme="majorHAnsi" w:cstheme="majorBidi" w:eastAsiaTheme="majorEastAsia" w:hAnsiTheme="majorHAnsi"/>
       <w:color w:themeColor="accent1" w:themeShade="bf" w:val="0F4761"/>
       <w:sz w:val="32"/>
       <w:szCs w:val="32"/>
@@ -1482,7 +1483,7 @@
     <w:qFormat/>
     <w:rsid w:val="007809bc"/>
     <w:rPr>
-      <w:rFonts w:eastAsia="新細明體" w:cs="" w:cstheme="majorBidi" w:eastAsiaTheme="majorEastAsia"/>
+      <w:rFonts w:eastAsia="" w:cs="" w:cstheme="majorBidi" w:eastAsiaTheme="majorEastAsia"/>
       <w:color w:themeColor="accent1" w:themeShade="bf" w:val="0F4761"/>
       <w:sz w:val="28"/>
       <w:szCs w:val="28"/>
@@ -1497,7 +1498,7 @@
     <w:qFormat/>
     <w:rsid w:val="007809bc"/>
     <w:rPr>
-      <w:rFonts w:eastAsia="新細明體" w:cs="" w:cstheme="majorBidi" w:eastAsiaTheme="majorEastAsia"/>
+      <w:rFonts w:eastAsia="" w:cs="" w:cstheme="majorBidi" w:eastAsiaTheme="majorEastAsia"/>
       <w:i/>
       <w:iCs/>
       <w:color w:themeColor="accent1" w:themeShade="bf" w:val="0F4761"/>
@@ -1512,7 +1513,7 @@
     <w:qFormat/>
     <w:rsid w:val="007809bc"/>
     <w:rPr>
-      <w:rFonts w:eastAsia="新細明體" w:cs="" w:cstheme="majorBidi" w:eastAsiaTheme="majorEastAsia"/>
+      <w:rFonts w:eastAsia="" w:cs="" w:cstheme="majorBidi" w:eastAsiaTheme="majorEastAsia"/>
       <w:color w:themeColor="accent1" w:themeShade="bf" w:val="0F4761"/>
     </w:rPr>
   </w:style>
@@ -1525,7 +1526,7 @@
     <w:qFormat/>
     <w:rsid w:val="007809bc"/>
     <w:rPr>
-      <w:rFonts w:eastAsia="新細明體" w:cs="" w:cstheme="majorBidi" w:eastAsiaTheme="majorEastAsia"/>
+      <w:rFonts w:eastAsia="" w:cs="" w:cstheme="majorBidi" w:eastAsiaTheme="majorEastAsia"/>
       <w:i/>
       <w:iCs/>
       <w:color w:themeColor="text1" w:themeTint="a6" w:val="595959"/>
@@ -1540,7 +1541,7 @@
     <w:qFormat/>
     <w:rsid w:val="007809bc"/>
     <w:rPr>
-      <w:rFonts w:eastAsia="新細明體" w:cs="" w:cstheme="majorBidi" w:eastAsiaTheme="majorEastAsia"/>
+      <w:rFonts w:eastAsia="" w:cs="" w:cstheme="majorBidi" w:eastAsiaTheme="majorEastAsia"/>
       <w:color w:themeColor="text1" w:themeTint="a6" w:val="595959"/>
     </w:rPr>
   </w:style>
@@ -1553,7 +1554,7 @@
     <w:qFormat/>
     <w:rsid w:val="007809bc"/>
     <w:rPr>
-      <w:rFonts w:eastAsia="新細明體" w:cs="" w:cstheme="majorBidi" w:eastAsiaTheme="majorEastAsia"/>
+      <w:rFonts w:eastAsia="" w:cs="" w:cstheme="majorBidi" w:eastAsiaTheme="majorEastAsia"/>
       <w:i/>
       <w:iCs/>
       <w:color w:themeColor="text1" w:themeTint="d8" w:val="272727"/>
@@ -1568,7 +1569,7 @@
     <w:qFormat/>
     <w:rsid w:val="007809bc"/>
     <w:rPr>
-      <w:rFonts w:eastAsia="新細明體" w:cs="" w:cstheme="majorBidi" w:eastAsiaTheme="majorEastAsia"/>
+      <w:rFonts w:eastAsia="" w:cs="" w:cstheme="majorBidi" w:eastAsiaTheme="majorEastAsia"/>
       <w:color w:themeColor="text1" w:themeTint="d8" w:val="272727"/>
     </w:rPr>
   </w:style>
@@ -1580,7 +1581,7 @@
     <w:qFormat/>
     <w:rsid w:val="007809bc"/>
     <w:rPr>
-      <w:rFonts w:ascii="Aptos Display" w:hAnsi="Aptos Display" w:eastAsia="新細明體" w:cs="" w:asciiTheme="majorHAnsi" w:cstheme="majorBidi" w:eastAsiaTheme="majorEastAsia" w:hAnsiTheme="majorHAnsi"/>
+      <w:rFonts w:ascii="Aptos Display" w:hAnsi="Aptos Display" w:eastAsia="" w:cs="" w:asciiTheme="majorHAnsi" w:cstheme="majorBidi" w:eastAsiaTheme="majorEastAsia" w:hAnsiTheme="majorHAnsi"/>
       <w:spacing w:val="-10"/>
       <w:kern w:val="2"/>
       <w:sz w:val="56"/>
@@ -1595,7 +1596,7 @@
     <w:qFormat/>
     <w:rsid w:val="007809bc"/>
     <w:rPr>
-      <w:rFonts w:eastAsia="新細明體" w:cs="" w:cstheme="majorBidi" w:eastAsiaTheme="majorEastAsia"/>
+      <w:rFonts w:eastAsia="" w:cs="" w:cstheme="majorBidi" w:eastAsiaTheme="majorEastAsia"/>
       <w:color w:themeColor="text1" w:themeTint="a6" w:val="595959"/>
       <w:spacing w:val="15"/>
       <w:sz w:val="28"/>
@@ -1725,7 +1726,7 @@
       <w:contextualSpacing/>
     </w:pPr>
     <w:rPr>
-      <w:rFonts w:ascii="Aptos Display" w:hAnsi="Aptos Display" w:eastAsia="新細明體" w:cs="" w:asciiTheme="majorHAnsi" w:cstheme="majorBidi" w:eastAsiaTheme="majorEastAsia" w:hAnsiTheme="majorHAnsi"/>
+      <w:rFonts w:ascii="Aptos Display" w:hAnsi="Aptos Display" w:eastAsia="" w:cs="" w:asciiTheme="majorHAnsi" w:cstheme="majorBidi" w:eastAsiaTheme="majorEastAsia" w:hAnsiTheme="majorHAnsi"/>
       <w:spacing w:val="-10"/>
       <w:kern w:val="2"/>
       <w:sz w:val="56"/>
@@ -1742,7 +1743,7 @@
     <w:rsid w:val="007809bc"/>
     <w:pPr/>
     <w:rPr>
-      <w:rFonts w:eastAsia="新細明體" w:cs="" w:cstheme="majorBidi" w:eastAsiaTheme="majorEastAsia"/>
+      <w:rFonts w:eastAsia="" w:cs="" w:cstheme="majorBidi" w:eastAsiaTheme="majorEastAsia"/>
       <w:color w:themeColor="text1" w:themeTint="a6" w:val="595959"/>
       <w:spacing w:val="15"/>
       <w:sz w:val="28"/>

</xml_diff>